<commit_message>
chore: D0PA1 closure batch -- soak_checkpoint record, pitch-claim retraction, av-sync flash tool
Adds the additive soak_checkpoint record type (60s cadence: elapsed_s,
frames_total, fps_median_60s, rss_mb, detect_rate_60s) needed for the
extended stability soak's Part B criteria. Retracts the prior "pitch
~0.1deg, structural limit" claim in features/attention.py and
stage1_step4_vectors.py in favor of the evidenced finding (detection-rate
collapse during look-down, not a fixed structural ceiling). Adds
av_sync_flash.py + its test, the closure-pack docs, and updates to
PROJECT_STATE/CLIENT_FIGURES/MATRIX_ROW_MAP/AUDIO_ACQUISITION/
RESPONSE_VERIFICATION and the two preregistration docx files.

Co-Authored-By: Claude Sonnet 5 <noreply@anthropic.com>
</commit_message>
<xml_diff>
--- a/docs/preregistration/D0PA1_Build_Status_Report.docx
+++ b/docs/preregistration/D0PA1_Build_Status_Report.docx
@@ -2291,7 +2291,7 @@
           <w:sz w:val="23"/>
           <w:szCs w:val="23"/>
         </w:rPr>
-        <w:t xml:space="preserve">5.4  Attention pitch detection is structurally unreliable</w:t>
+        <w:t>5.4  Attention pitch: a retracted claim, and what the evidence now says</w:t>
       </w:r>
     </w:p>
     <w:tbl>
@@ -2344,7 +2344,7 @@
                 <w:sz w:val="20"/>
                 <w:szCs w:val="20"/>
               </w:rPr>
-              <w:t xml:space="preserve">Directed testing established that horizontal head orientation (yaw) is detected reliably, but that pitch — looking up or down — is not. On a maximal, sustained, verified chin-to-chest look-down, measured pitch stayed at approximately 0.1° and the oriented-rate stayed at 1.0, indistinguishable from looking directly at the screen.</w:t>
+              <w:t xml:space="preserve">Directed testing established that horizontal head orientation (yaw) is detected reliably. Vertical orientation (pitch) is not usable for ROI attribution. An earlier version of this section gave a figure and a mechanism for that, and both are retracted here.</w:t>
             </w:r>
           </w:p>
           <w:p>
@@ -2357,7 +2357,20 @@
                 <w:sz w:val="20"/>
                 <w:szCs w:val="20"/>
               </w:rPr>
-              <w:t xml:space="preserve">The cause is not a bug. The rotation decomposition is provably exact on synthetic rotations; the face foreshortens when looking down, degrading the landmark data pitch depends on. It is not fixable with a single webcam at this resolution.</w:t>
+              <w:t xml:space="preserve">The retracted claim was that on a maximal, sustained chin-to-chest look-down, measured pitch stayed at approximately 0.1°, and that the cause was a structural limit of single-camera landmark head-pose, not fixable at this resolution. That figure had no documented verification method anywhere in the repository, and a later graded-intensity capture — judged independently in real time, before any number was shown — contradicts it: maximal held look-down attempts registered pitch as large as −43.1°, with magnitude scaling roughly with commanded intensity (small ≈6°, medium ≈2–3°, maximal ≈15–32°). Data: logs/orientation_trials.jsonl.</w:t>
+            </w:r>
+          </w:p>
+          <w:p>
+            <w:pPr>
+              <w:spacing w:after="120" w:before="0"/>
+            </w:pPr>
+            <w:r>
+              <w:rPr>
+                <w:rFonts w:ascii="Calibri" w:cs="Calibri" w:eastAsia="Calibri" w:hAnsi="Calibri"/>
+                <w:sz w:val="20"/>
+                <w:szCs w:val="20"/>
+              </w:rPr>
+              <w:t xml:space="preserve">What actually fails during look-down is face detection, not the pitch measurement. Detection rate fell to between 0.08% and 27.5% across the graded attempts, including on attempts where pitch registered at large magnitude. Because most window-samples are missing rather than present, the oriented-rate still reads close to 1.0 — a missingness artefact, not a reading of orientation. Two facts remain unexplained and are not smoothed over: a sign inconsistency between the medium and maximal readings, and why detection collapses this severely. The practical conclusion is unchanged — pitch-based ROI attribution is not viable today — but the mechanism is reopened, not settled.</w:t>
             </w:r>
           </w:p>
           <w:p>

</xml_diff>